<commit_message>
fix: label author voice pack as snapshot
</commit_message>
<xml_diff>
--- a/downloads/production/kdp/author-voice-copyedit/lady-d-author-voice-copyedit-pack.docx
+++ b/downloads/production/kdp/author-voice-copyedit/lady-d-author-voice-copyedit-pack.docx
@@ -223,7 +223,7 @@
                 <w:b w:val="0"/>
                 <w:sz w:val="19"/>
               </w:rPr>
-              <w:t>Commit</w:t>
+              <w:t>Snapshot</w:t>
             </w:r>
           </w:p>
         </w:tc>
@@ -242,7 +242,7 @@
                 <w:b w:val="0"/>
                 <w:sz w:val="19"/>
               </w:rPr>
-              <w:t>9aab4b1</w:t>
+              <w:t>Production snapshot</w:t>
             </w:r>
           </w:p>
         </w:tc>

</xml_diff>